<commit_message>
WIP. Implementadas plantillas simples sin caddie
</commit_message>
<xml_diff>
--- a/backend_flask/plantillas_word/A6- Solicitud Excepcional.docx
+++ b/backend_flask/plantillas_word/A6- Solicitud Excepcional.docx
@@ -1,6 +1,6 @@
 
 <file path=word/document.xml><?xml version="1.0" encoding="utf-8"?>
-<w:document xmlns:wpc="http://schemas.microsoft.com/office/word/2010/wordprocessingCanvas" xmlns:cx="http://schemas.microsoft.com/office/drawing/2014/chartex" xmlns:cx1="http://schemas.microsoft.com/office/drawing/2015/9/8/chartex" xmlns:cx2="http://schemas.microsoft.com/office/drawing/2015/10/21/chartex" xmlns:cx3="http://schemas.microsoft.com/office/drawing/2016/5/9/chartex" xmlns:cx4="http://schemas.microsoft.com/office/drawing/2016/5/10/chartex" xmlns:cx5="http://schemas.microsoft.com/office/drawing/2016/5/11/chartex" xmlns:cx6="http://schemas.microsoft.com/office/drawing/2016/5/12/chartex" xmlns:cx7="http://schemas.microsoft.com/office/drawing/2016/5/13/chartex" xmlns:cx8="http://schemas.microsoft.com/office/drawing/2016/5/14/chartex" xmlns:mc="http://schemas.openxmlformats.org/markup-compatibility/2006" xmlns:aink="http://schemas.microsoft.com/office/drawing/2016/ink" xmlns:am3d="http://schemas.microsoft.com/office/drawing/2017/model3d" xmlns:o="urn:schemas-microsoft-com:office:office" xmlns:oel="http://schemas.microsoft.com/office/2019/extlst" xmlns:r="http://schemas.openxmlformats.org/officeDocument/2006/relationships" xmlns:m="http://schemas.openxmlformats.org/officeDocument/2006/math" xmlns:v="urn:schemas-microsoft-com:vml" xmlns:wp14="http://schemas.microsoft.com/office/word/2010/wordprocessingDrawing" xmlns:wp="http://schemas.openxmlformats.org/drawingml/2006/wordprocessingDrawing" xmlns:w10="urn:schemas-microsoft-com:office:word" xmlns:w="http://schemas.openxmlformats.org/wordprocessingml/2006/main" xmlns:w14="http://schemas.microsoft.com/office/word/2010/wordml" xmlns:w15="http://schemas.microsoft.com/office/word/2012/wordml" xmlns:w16cex="http://schemas.microsoft.com/office/word/2018/wordml/cex" xmlns:w16cid="http://schemas.microsoft.com/office/word/2016/wordml/cid" xmlns:w16="http://schemas.microsoft.com/office/word/2018/wordml" xmlns:w16du="http://schemas.microsoft.com/office/word/2023/wordml/word16du" xmlns:w16sdtdh="http://schemas.microsoft.com/office/word/2020/wordml/sdtdatahash" xmlns:w16sdtfl="http://schemas.microsoft.com/office/word/2024/wordml/sdtformatlock" xmlns:w16se="http://schemas.microsoft.com/office/word/2015/wordml/symex" xmlns:wpg="http://schemas.microsoft.com/office/word/2010/wordprocessingGroup" xmlns:wpi="http://schemas.microsoft.com/office/word/2010/wordprocessingInk" xmlns:wne="http://schemas.microsoft.com/office/word/2006/wordml" xmlns:wps="http://schemas.microsoft.com/office/word/2010/wordprocessingShape" mc:Ignorable="w14 w15 w16se w16cid w16 w16cex w16sdtdh w16sdtfl w16du wp14">
+<w:document xmlns:wpc="http://schemas.microsoft.com/office/word/2010/wordprocessingCanvas" xmlns:cx="http://schemas.microsoft.com/office/drawing/2014/chartex" xmlns:cx1="http://schemas.microsoft.com/office/drawing/2015/9/8/chartex" xmlns:cx2="http://schemas.microsoft.com/office/drawing/2015/10/21/chartex" xmlns:cx3="http://schemas.microsoft.com/office/drawing/2016/5/9/chartex" xmlns:cx4="http://schemas.microsoft.com/office/drawing/2016/5/10/chartex" xmlns:cx5="http://schemas.microsoft.com/office/drawing/2016/5/11/chartex" xmlns:cx6="http://schemas.microsoft.com/office/drawing/2016/5/12/chartex" xmlns:cx7="http://schemas.microsoft.com/office/drawing/2016/5/13/chartex" xmlns:cx8="http://schemas.microsoft.com/office/drawing/2016/5/14/chartex" xmlns:mc="http://schemas.openxmlformats.org/markup-compatibility/2006" xmlns:aink="http://schemas.microsoft.com/office/drawing/2016/ink" xmlns:am3d="http://schemas.microsoft.com/office/drawing/2017/model3d" xmlns:o="urn:schemas-microsoft-com:office:office" xmlns:r="http://schemas.openxmlformats.org/officeDocument/2006/relationships" xmlns:m="http://schemas.openxmlformats.org/officeDocument/2006/math" xmlns:v="urn:schemas-microsoft-com:vml" xmlns:wp14="http://schemas.microsoft.com/office/word/2010/wordprocessingDrawing" xmlns:wp="http://schemas.openxmlformats.org/drawingml/2006/wordprocessingDrawing" xmlns:w10="urn:schemas-microsoft-com:office:word" xmlns:w="http://schemas.openxmlformats.org/wordprocessingml/2006/main" xmlns:w14="http://schemas.microsoft.com/office/word/2010/wordml" xmlns:w15="http://schemas.microsoft.com/office/word/2012/wordml" xmlns:w16cex="http://schemas.microsoft.com/office/word/2018/wordml/cex" xmlns:w16cid="http://schemas.microsoft.com/office/word/2016/wordml/cid" xmlns:w16="http://schemas.microsoft.com/office/word/2018/wordml" xmlns:w16sdtdh="http://schemas.microsoft.com/office/word/2020/wordml/sdtdatahash" xmlns:w16se="http://schemas.microsoft.com/office/word/2015/wordml/symex" xmlns:wpg="http://schemas.microsoft.com/office/word/2010/wordprocessingGroup" xmlns:wpi="http://schemas.microsoft.com/office/word/2010/wordprocessingInk" xmlns:wne="http://schemas.microsoft.com/office/word/2006/wordml" xmlns:wps="http://schemas.microsoft.com/office/word/2010/wordprocessingShape" mc:Ignorable="w14 w15 w16se w16cid w16 w16cex w16sdtdh wp14">
   <w:body>
     <w:p>
       <w:pPr>
@@ -115,6 +115,13 @@
                 <w:szCs w:val="24"/>
               </w:rPr>
             </w:pPr>
+            <w:r>
+              <w:rPr>
+                <w:sz w:val="24"/>
+                <w:szCs w:val="24"/>
+              </w:rPr>
+              <w:t>[CENTRO_NOMBRE]</w:t>
+            </w:r>
           </w:p>
         </w:tc>
       </w:tr>
@@ -153,6 +160,13 @@
                 <w:szCs w:val="24"/>
               </w:rPr>
             </w:pPr>
+            <w:r>
+              <w:rPr>
+                <w:sz w:val="24"/>
+                <w:szCs w:val="24"/>
+              </w:rPr>
+              <w:t>[CENTRO_CODIGO]</w:t>
+            </w:r>
           </w:p>
         </w:tc>
         <w:tc>
@@ -189,6 +203,13 @@
                 <w:szCs w:val="24"/>
               </w:rPr>
             </w:pPr>
+            <w:r>
+              <w:rPr>
+                <w:sz w:val="24"/>
+                <w:szCs w:val="24"/>
+              </w:rPr>
+              <w:t>[CENTRO_NIF]</w:t>
+            </w:r>
           </w:p>
         </w:tc>
       </w:tr>
@@ -242,6 +263,13 @@
                 <w:szCs w:val="24"/>
               </w:rPr>
             </w:pPr>
+            <w:r>
+              <w:rPr>
+                <w:sz w:val="24"/>
+                <w:szCs w:val="24"/>
+              </w:rPr>
+              <w:t>[NOMBRE_TUTOR]</w:t>
+            </w:r>
           </w:p>
         </w:tc>
       </w:tr>
@@ -280,6 +308,13 @@
                 <w:szCs w:val="24"/>
               </w:rPr>
             </w:pPr>
+            <w:r>
+              <w:rPr>
+                <w:sz w:val="24"/>
+                <w:szCs w:val="24"/>
+              </w:rPr>
+              <w:t>[GRADOS_TUTOR]</w:t>
+            </w:r>
           </w:p>
         </w:tc>
         <w:tc>
@@ -316,6 +351,13 @@
                 <w:szCs w:val="24"/>
               </w:rPr>
             </w:pPr>
+            <w:r>
+              <w:rPr>
+                <w:sz w:val="24"/>
+                <w:szCs w:val="24"/>
+              </w:rPr>
+              <w:t>[CURSO]</w:t>
+            </w:r>
           </w:p>
         </w:tc>
       </w:tr>
@@ -391,6 +433,13 @@
                 <w:szCs w:val="24"/>
               </w:rPr>
             </w:pPr>
+            <w:r>
+              <w:rPr>
+                <w:sz w:val="24"/>
+                <w:szCs w:val="24"/>
+              </w:rPr>
+              <w:t>[EMP_NOMBRE]</w:t>
+            </w:r>
           </w:p>
         </w:tc>
       </w:tr>
@@ -465,6 +514,13 @@
                 <w:szCs w:val="24"/>
               </w:rPr>
             </w:pPr>
+            <w:r>
+              <w:rPr>
+                <w:sz w:val="24"/>
+                <w:szCs w:val="24"/>
+              </w:rPr>
+              <w:t>[EMP_CIF]</w:t>
+            </w:r>
           </w:p>
         </w:tc>
       </w:tr>
@@ -518,6 +574,13 @@
                 <w:szCs w:val="24"/>
               </w:rPr>
             </w:pPr>
+            <w:r>
+              <w:rPr>
+                <w:sz w:val="24"/>
+                <w:szCs w:val="24"/>
+              </w:rPr>
+              <w:t>[TUTOR_NOMBRE]</w:t>
+            </w:r>
           </w:p>
         </w:tc>
       </w:tr>
@@ -530,9 +593,9 @@
         <w:tblLook w:val="04A0" w:firstRow="1" w:lastRow="0" w:firstColumn="1" w:lastColumn="0" w:noHBand="0" w:noVBand="1"/>
       </w:tblPr>
       <w:tblGrid>
-        <w:gridCol w:w="2282"/>
+        <w:gridCol w:w="2283"/>
         <w:gridCol w:w="3857"/>
-        <w:gridCol w:w="1276"/>
+        <w:gridCol w:w="1275"/>
         <w:gridCol w:w="2321"/>
       </w:tblGrid>
       <w:tr>
@@ -597,6 +660,13 @@
                 <w:szCs w:val="24"/>
               </w:rPr>
             </w:pPr>
+            <w:r>
+              <w:rPr>
+                <w:sz w:val="24"/>
+                <w:szCs w:val="24"/>
+              </w:rPr>
+              <w:t>[NOMBRE]</w:t>
+            </w:r>
           </w:p>
         </w:tc>
         <w:tc>
@@ -647,182 +717,13 @@
                 <w:szCs w:val="24"/>
               </w:rPr>
             </w:pPr>
-          </w:p>
-        </w:tc>
-      </w:tr>
-      <w:tr>
-        <w:tc>
-          <w:tcPr>
-            <w:tcW w:w="1172" w:type="pct"/>
-            <w:shd w:val="clear" w:color="auto" w:fill="F2F2F2" w:themeFill="background1" w:themeFillShade="F2"/>
-          </w:tcPr>
-          <w:p>
-            <w:pPr>
-              <w:jc w:val="both"/>
-              <w:rPr>
-                <w:sz w:val="20"/>
-                <w:szCs w:val="20"/>
-              </w:rPr>
-            </w:pPr>
-            <w:r>
-              <w:rPr>
-                <w:sz w:val="20"/>
-                <w:szCs w:val="20"/>
-              </w:rPr>
-              <w:t>NOMBRE Y APELLIDOS</w:t>
-            </w:r>
-          </w:p>
-        </w:tc>
-        <w:tc>
-          <w:tcPr>
-            <w:tcW w:w="1981" w:type="pct"/>
-          </w:tcPr>
-          <w:p>
-            <w:pPr>
-              <w:jc w:val="both"/>
+            <w:r>
               <w:rPr>
                 <w:sz w:val="24"/>
                 <w:szCs w:val="24"/>
               </w:rPr>
-            </w:pPr>
-          </w:p>
-        </w:tc>
-        <w:tc>
-          <w:tcPr>
-            <w:tcW w:w="655" w:type="pct"/>
-            <w:shd w:val="clear" w:color="auto" w:fill="F2F2F2" w:themeFill="background1" w:themeFillShade="F2"/>
-          </w:tcPr>
-          <w:p>
-            <w:pPr>
-              <w:jc w:val="both"/>
-              <w:rPr>
-                <w:sz w:val="20"/>
-                <w:szCs w:val="20"/>
-              </w:rPr>
-            </w:pPr>
-            <w:r>
-              <w:rPr>
-                <w:sz w:val="20"/>
-                <w:szCs w:val="20"/>
-              </w:rPr>
-              <w:t>DNI/</w:t>
-            </w:r>
-            <w:r>
-              <w:rPr>
-                <w:sz w:val="20"/>
-                <w:szCs w:val="20"/>
-              </w:rPr>
-              <w:t>NIF/</w:t>
-            </w:r>
-            <w:r>
-              <w:rPr>
-                <w:sz w:val="20"/>
-                <w:szCs w:val="20"/>
-              </w:rPr>
-              <w:t>NIE</w:t>
-            </w:r>
-          </w:p>
-        </w:tc>
-        <w:tc>
-          <w:tcPr>
-            <w:tcW w:w="1192" w:type="pct"/>
-          </w:tcPr>
-          <w:p>
-            <w:pPr>
-              <w:jc w:val="both"/>
-              <w:rPr>
-                <w:sz w:val="24"/>
-                <w:szCs w:val="24"/>
-              </w:rPr>
-            </w:pPr>
-          </w:p>
-        </w:tc>
-      </w:tr>
-      <w:tr>
-        <w:tc>
-          <w:tcPr>
-            <w:tcW w:w="1172" w:type="pct"/>
-            <w:shd w:val="clear" w:color="auto" w:fill="F2F2F2" w:themeFill="background1" w:themeFillShade="F2"/>
-          </w:tcPr>
-          <w:p>
-            <w:pPr>
-              <w:jc w:val="both"/>
-              <w:rPr>
-                <w:sz w:val="20"/>
-                <w:szCs w:val="20"/>
-              </w:rPr>
-            </w:pPr>
-            <w:r>
-              <w:rPr>
-                <w:sz w:val="20"/>
-                <w:szCs w:val="20"/>
-              </w:rPr>
-              <w:t>NOMBRE Y APELLIDOS</w:t>
-            </w:r>
-          </w:p>
-        </w:tc>
-        <w:tc>
-          <w:tcPr>
-            <w:tcW w:w="1981" w:type="pct"/>
-          </w:tcPr>
-          <w:p>
-            <w:pPr>
-              <w:jc w:val="both"/>
-              <w:rPr>
-                <w:sz w:val="24"/>
-                <w:szCs w:val="24"/>
-              </w:rPr>
-            </w:pPr>
-          </w:p>
-        </w:tc>
-        <w:tc>
-          <w:tcPr>
-            <w:tcW w:w="655" w:type="pct"/>
-            <w:shd w:val="clear" w:color="auto" w:fill="F2F2F2" w:themeFill="background1" w:themeFillShade="F2"/>
-          </w:tcPr>
-          <w:p>
-            <w:pPr>
-              <w:jc w:val="both"/>
-              <w:rPr>
-                <w:sz w:val="20"/>
-                <w:szCs w:val="20"/>
-              </w:rPr>
-            </w:pPr>
-            <w:r>
-              <w:rPr>
-                <w:sz w:val="20"/>
-                <w:szCs w:val="20"/>
-              </w:rPr>
-              <w:t>DNI/</w:t>
-            </w:r>
-            <w:r>
-              <w:rPr>
-                <w:sz w:val="20"/>
-                <w:szCs w:val="20"/>
-              </w:rPr>
-              <w:t>NIF/</w:t>
-            </w:r>
-            <w:r>
-              <w:rPr>
-                <w:sz w:val="20"/>
-                <w:szCs w:val="20"/>
-              </w:rPr>
-              <w:t>NIE</w:t>
-            </w:r>
-          </w:p>
-        </w:tc>
-        <w:tc>
-          <w:tcPr>
-            <w:tcW w:w="1192" w:type="pct"/>
-          </w:tcPr>
-          <w:p>
-            <w:pPr>
-              <w:jc w:val="both"/>
-              <w:rPr>
-                <w:sz w:val="24"/>
-                <w:szCs w:val="24"/>
-              </w:rPr>
-            </w:pPr>
+              <w:t>[NIF]</w:t>
+            </w:r>
           </w:p>
         </w:tc>
       </w:tr>
@@ -999,23 +900,7 @@
           <w:sz w:val="20"/>
           <w:szCs w:val="20"/>
         </w:rPr>
-        <w:t>En…………………………………</w:t>
-      </w:r>
-      <w:proofErr w:type="gramStart"/>
-      <w:r>
-        <w:rPr>
-          <w:sz w:val="20"/>
-          <w:szCs w:val="20"/>
-        </w:rPr>
-        <w:t>…….</w:t>
-      </w:r>
-      <w:proofErr w:type="gramEnd"/>
-      <w:r>
-        <w:rPr>
-          <w:sz w:val="20"/>
-          <w:szCs w:val="20"/>
-        </w:rPr>
-        <w:t>a….de………………………………de…..</w:t>
+        <w:t>[LUGAR_FECHA]</w:t>
       </w:r>
     </w:p>
     <w:p>
@@ -1026,30 +911,12 @@
           <w:szCs w:val="20"/>
         </w:rPr>
       </w:pPr>
-      <w:proofErr w:type="spellStart"/>
-      <w:proofErr w:type="gramStart"/>
       <w:r>
         <w:rPr>
           <w:sz w:val="20"/>
           <w:szCs w:val="20"/>
         </w:rPr>
-        <w:t>Fdo</w:t>
-      </w:r>
-      <w:proofErr w:type="spellEnd"/>
-      <w:r>
-        <w:rPr>
-          <w:sz w:val="20"/>
-          <w:szCs w:val="20"/>
-        </w:rPr>
-        <w:t>:…</w:t>
-      </w:r>
-      <w:proofErr w:type="gramEnd"/>
-      <w:r>
-        <w:rPr>
-          <w:sz w:val="20"/>
-          <w:szCs w:val="20"/>
-        </w:rPr>
-        <w:t>……………………………………………….</w:t>
+        <w:t>Fdo:………………………………………………….</w:t>
       </w:r>
     </w:p>
     <w:p>
@@ -1809,7 +1676,7 @@
 </file>
 
 <file path=word/endnotes.xml><?xml version="1.0" encoding="utf-8"?>
-<w:endnotes xmlns:wpc="http://schemas.microsoft.com/office/word/2010/wordprocessingCanvas" xmlns:cx="http://schemas.microsoft.com/office/drawing/2014/chartex" xmlns:cx1="http://schemas.microsoft.com/office/drawing/2015/9/8/chartex" xmlns:cx2="http://schemas.microsoft.com/office/drawing/2015/10/21/chartex" xmlns:cx3="http://schemas.microsoft.com/office/drawing/2016/5/9/chartex" xmlns:cx4="http://schemas.microsoft.com/office/drawing/2016/5/10/chartex" xmlns:cx5="http://schemas.microsoft.com/office/drawing/2016/5/11/chartex" xmlns:cx6="http://schemas.microsoft.com/office/drawing/2016/5/12/chartex" xmlns:cx7="http://schemas.microsoft.com/office/drawing/2016/5/13/chartex" xmlns:cx8="http://schemas.microsoft.com/office/drawing/2016/5/14/chartex" xmlns:mc="http://schemas.openxmlformats.org/markup-compatibility/2006" xmlns:aink="http://schemas.microsoft.com/office/drawing/2016/ink" xmlns:am3d="http://schemas.microsoft.com/office/drawing/2017/model3d" xmlns:o="urn:schemas-microsoft-com:office:office" xmlns:oel="http://schemas.microsoft.com/office/2019/extlst" xmlns:r="http://schemas.openxmlformats.org/officeDocument/2006/relationships" xmlns:m="http://schemas.openxmlformats.org/officeDocument/2006/math" xmlns:v="urn:schemas-microsoft-com:vml" xmlns:wp14="http://schemas.microsoft.com/office/word/2010/wordprocessingDrawing" xmlns:wp="http://schemas.openxmlformats.org/drawingml/2006/wordprocessingDrawing" xmlns:w10="urn:schemas-microsoft-com:office:word" xmlns:w="http://schemas.openxmlformats.org/wordprocessingml/2006/main" xmlns:w14="http://schemas.microsoft.com/office/word/2010/wordml" xmlns:w15="http://schemas.microsoft.com/office/word/2012/wordml" xmlns:w16cex="http://schemas.microsoft.com/office/word/2018/wordml/cex" xmlns:w16cid="http://schemas.microsoft.com/office/word/2016/wordml/cid" xmlns:w16="http://schemas.microsoft.com/office/word/2018/wordml" xmlns:w16du="http://schemas.microsoft.com/office/word/2023/wordml/word16du" xmlns:w16sdtdh="http://schemas.microsoft.com/office/word/2020/wordml/sdtdatahash" xmlns:w16sdtfl="http://schemas.microsoft.com/office/word/2024/wordml/sdtformatlock" xmlns:w16se="http://schemas.microsoft.com/office/word/2015/wordml/symex" xmlns:wpg="http://schemas.microsoft.com/office/word/2010/wordprocessingGroup" xmlns:wpi="http://schemas.microsoft.com/office/word/2010/wordprocessingInk" xmlns:wne="http://schemas.microsoft.com/office/word/2006/wordml" xmlns:wps="http://schemas.microsoft.com/office/word/2010/wordprocessingShape" mc:Ignorable="w14 w15 w16se w16cid w16 w16cex w16sdtdh w16sdtfl w16du wp14">
+<w:endnotes xmlns:wpc="http://schemas.microsoft.com/office/word/2010/wordprocessingCanvas" xmlns:cx="http://schemas.microsoft.com/office/drawing/2014/chartex" xmlns:cx1="http://schemas.microsoft.com/office/drawing/2015/9/8/chartex" xmlns:cx2="http://schemas.microsoft.com/office/drawing/2015/10/21/chartex" xmlns:cx3="http://schemas.microsoft.com/office/drawing/2016/5/9/chartex" xmlns:cx4="http://schemas.microsoft.com/office/drawing/2016/5/10/chartex" xmlns:cx5="http://schemas.microsoft.com/office/drawing/2016/5/11/chartex" xmlns:cx6="http://schemas.microsoft.com/office/drawing/2016/5/12/chartex" xmlns:cx7="http://schemas.microsoft.com/office/drawing/2016/5/13/chartex" xmlns:cx8="http://schemas.microsoft.com/office/drawing/2016/5/14/chartex" xmlns:mc="http://schemas.openxmlformats.org/markup-compatibility/2006" xmlns:aink="http://schemas.microsoft.com/office/drawing/2016/ink" xmlns:am3d="http://schemas.microsoft.com/office/drawing/2017/model3d" xmlns:o="urn:schemas-microsoft-com:office:office" xmlns:r="http://schemas.openxmlformats.org/officeDocument/2006/relationships" xmlns:m="http://schemas.openxmlformats.org/officeDocument/2006/math" xmlns:v="urn:schemas-microsoft-com:vml" xmlns:wp14="http://schemas.microsoft.com/office/word/2010/wordprocessingDrawing" xmlns:wp="http://schemas.openxmlformats.org/drawingml/2006/wordprocessingDrawing" xmlns:w10="urn:schemas-microsoft-com:office:word" xmlns:w="http://schemas.openxmlformats.org/wordprocessingml/2006/main" xmlns:w14="http://schemas.microsoft.com/office/word/2010/wordml" xmlns:w15="http://schemas.microsoft.com/office/word/2012/wordml" xmlns:w16cex="http://schemas.microsoft.com/office/word/2018/wordml/cex" xmlns:w16cid="http://schemas.microsoft.com/office/word/2016/wordml/cid" xmlns:w16="http://schemas.microsoft.com/office/word/2018/wordml" xmlns:w16sdtdh="http://schemas.microsoft.com/office/word/2020/wordml/sdtdatahash" xmlns:w16se="http://schemas.microsoft.com/office/word/2015/wordml/symex" xmlns:wpg="http://schemas.microsoft.com/office/word/2010/wordprocessingGroup" xmlns:wpi="http://schemas.microsoft.com/office/word/2010/wordprocessingInk" xmlns:wne="http://schemas.microsoft.com/office/word/2006/wordml" xmlns:wps="http://schemas.microsoft.com/office/word/2010/wordprocessingShape" mc:Ignorable="w14 w15 w16se w16cid w16 w16cex w16sdtdh wp14">
   <w:endnote w:type="separator" w:id="-1">
     <w:p>
       <w:pPr>
@@ -1834,7 +1701,7 @@
 </file>
 
 <file path=word/footnotes.xml><?xml version="1.0" encoding="utf-8"?>
-<w:footnotes xmlns:wpc="http://schemas.microsoft.com/office/word/2010/wordprocessingCanvas" xmlns:cx="http://schemas.microsoft.com/office/drawing/2014/chartex" xmlns:cx1="http://schemas.microsoft.com/office/drawing/2015/9/8/chartex" xmlns:cx2="http://schemas.microsoft.com/office/drawing/2015/10/21/chartex" xmlns:cx3="http://schemas.microsoft.com/office/drawing/2016/5/9/chartex" xmlns:cx4="http://schemas.microsoft.com/office/drawing/2016/5/10/chartex" xmlns:cx5="http://schemas.microsoft.com/office/drawing/2016/5/11/chartex" xmlns:cx6="http://schemas.microsoft.com/office/drawing/2016/5/12/chartex" xmlns:cx7="http://schemas.microsoft.com/office/drawing/2016/5/13/chartex" xmlns:cx8="http://schemas.microsoft.com/office/drawing/2016/5/14/chartex" xmlns:mc="http://schemas.openxmlformats.org/markup-compatibility/2006" xmlns:aink="http://schemas.microsoft.com/office/drawing/2016/ink" xmlns:am3d="http://schemas.microsoft.com/office/drawing/2017/model3d" xmlns:o="urn:schemas-microsoft-com:office:office" xmlns:oel="http://schemas.microsoft.com/office/2019/extlst" xmlns:r="http://schemas.openxmlformats.org/officeDocument/2006/relationships" xmlns:m="http://schemas.openxmlformats.org/officeDocument/2006/math" xmlns:v="urn:schemas-microsoft-com:vml" xmlns:wp14="http://schemas.microsoft.com/office/word/2010/wordprocessingDrawing" xmlns:wp="http://schemas.openxmlformats.org/drawingml/2006/wordprocessingDrawing" xmlns:w10="urn:schemas-microsoft-com:office:word" xmlns:w="http://schemas.openxmlformats.org/wordprocessingml/2006/main" xmlns:w14="http://schemas.microsoft.com/office/word/2010/wordml" xmlns:w15="http://schemas.microsoft.com/office/word/2012/wordml" xmlns:w16cex="http://schemas.microsoft.com/office/word/2018/wordml/cex" xmlns:w16cid="http://schemas.microsoft.com/office/word/2016/wordml/cid" xmlns:w16="http://schemas.microsoft.com/office/word/2018/wordml" xmlns:w16du="http://schemas.microsoft.com/office/word/2023/wordml/word16du" xmlns:w16sdtdh="http://schemas.microsoft.com/office/word/2020/wordml/sdtdatahash" xmlns:w16sdtfl="http://schemas.microsoft.com/office/word/2024/wordml/sdtformatlock" xmlns:w16se="http://schemas.microsoft.com/office/word/2015/wordml/symex" xmlns:wpg="http://schemas.microsoft.com/office/word/2010/wordprocessingGroup" xmlns:wpi="http://schemas.microsoft.com/office/word/2010/wordprocessingInk" xmlns:wne="http://schemas.microsoft.com/office/word/2006/wordml" xmlns:wps="http://schemas.microsoft.com/office/word/2010/wordprocessingShape" mc:Ignorable="w14 w15 w16se w16cid w16 w16cex w16sdtdh w16sdtfl w16du wp14">
+<w:footnotes xmlns:wpc="http://schemas.microsoft.com/office/word/2010/wordprocessingCanvas" xmlns:cx="http://schemas.microsoft.com/office/drawing/2014/chartex" xmlns:cx1="http://schemas.microsoft.com/office/drawing/2015/9/8/chartex" xmlns:cx2="http://schemas.microsoft.com/office/drawing/2015/10/21/chartex" xmlns:cx3="http://schemas.microsoft.com/office/drawing/2016/5/9/chartex" xmlns:cx4="http://schemas.microsoft.com/office/drawing/2016/5/10/chartex" xmlns:cx5="http://schemas.microsoft.com/office/drawing/2016/5/11/chartex" xmlns:cx6="http://schemas.microsoft.com/office/drawing/2016/5/12/chartex" xmlns:cx7="http://schemas.microsoft.com/office/drawing/2016/5/13/chartex" xmlns:cx8="http://schemas.microsoft.com/office/drawing/2016/5/14/chartex" xmlns:mc="http://schemas.openxmlformats.org/markup-compatibility/2006" xmlns:aink="http://schemas.microsoft.com/office/drawing/2016/ink" xmlns:am3d="http://schemas.microsoft.com/office/drawing/2017/model3d" xmlns:o="urn:schemas-microsoft-com:office:office" xmlns:r="http://schemas.openxmlformats.org/officeDocument/2006/relationships" xmlns:m="http://schemas.openxmlformats.org/officeDocument/2006/math" xmlns:v="urn:schemas-microsoft-com:vml" xmlns:wp14="http://schemas.microsoft.com/office/word/2010/wordprocessingDrawing" xmlns:wp="http://schemas.openxmlformats.org/drawingml/2006/wordprocessingDrawing" xmlns:w10="urn:schemas-microsoft-com:office:word" xmlns:w="http://schemas.openxmlformats.org/wordprocessingml/2006/main" xmlns:w14="http://schemas.microsoft.com/office/word/2010/wordml" xmlns:w15="http://schemas.microsoft.com/office/word/2012/wordml" xmlns:w16cex="http://schemas.microsoft.com/office/word/2018/wordml/cex" xmlns:w16cid="http://schemas.microsoft.com/office/word/2016/wordml/cid" xmlns:w16="http://schemas.microsoft.com/office/word/2018/wordml" xmlns:w16sdtdh="http://schemas.microsoft.com/office/word/2020/wordml/sdtdatahash" xmlns:w16se="http://schemas.microsoft.com/office/word/2015/wordml/symex" xmlns:wpg="http://schemas.microsoft.com/office/word/2010/wordprocessingGroup" xmlns:wpi="http://schemas.microsoft.com/office/word/2010/wordprocessingInk" xmlns:wne="http://schemas.microsoft.com/office/word/2006/wordml" xmlns:wps="http://schemas.microsoft.com/office/word/2010/wordprocessingShape" mc:Ignorable="w14 w15 w16se w16cid w16 w16cex w16sdtdh wp14">
   <w:footnote w:type="separator" w:id="-1">
     <w:p>
       <w:pPr>
@@ -1859,7 +1726,7 @@
 </file>
 
 <file path=word/header1.xml><?xml version="1.0" encoding="utf-8"?>
-<w:hdr xmlns:wpc="http://schemas.microsoft.com/office/word/2010/wordprocessingCanvas" xmlns:cx="http://schemas.microsoft.com/office/drawing/2014/chartex" xmlns:cx1="http://schemas.microsoft.com/office/drawing/2015/9/8/chartex" xmlns:cx2="http://schemas.microsoft.com/office/drawing/2015/10/21/chartex" xmlns:cx3="http://schemas.microsoft.com/office/drawing/2016/5/9/chartex" xmlns:cx4="http://schemas.microsoft.com/office/drawing/2016/5/10/chartex" xmlns:cx5="http://schemas.microsoft.com/office/drawing/2016/5/11/chartex" xmlns:cx6="http://schemas.microsoft.com/office/drawing/2016/5/12/chartex" xmlns:cx7="http://schemas.microsoft.com/office/drawing/2016/5/13/chartex" xmlns:cx8="http://schemas.microsoft.com/office/drawing/2016/5/14/chartex" xmlns:mc="http://schemas.openxmlformats.org/markup-compatibility/2006" xmlns:aink="http://schemas.microsoft.com/office/drawing/2016/ink" xmlns:am3d="http://schemas.microsoft.com/office/drawing/2017/model3d" xmlns:o="urn:schemas-microsoft-com:office:office" xmlns:oel="http://schemas.microsoft.com/office/2019/extlst" xmlns:r="http://schemas.openxmlformats.org/officeDocument/2006/relationships" xmlns:m="http://schemas.openxmlformats.org/officeDocument/2006/math" xmlns:v="urn:schemas-microsoft-com:vml" xmlns:wp14="http://schemas.microsoft.com/office/word/2010/wordprocessingDrawing" xmlns:wp="http://schemas.openxmlformats.org/drawingml/2006/wordprocessingDrawing" xmlns:w10="urn:schemas-microsoft-com:office:word" xmlns:w="http://schemas.openxmlformats.org/wordprocessingml/2006/main" xmlns:w14="http://schemas.microsoft.com/office/word/2010/wordml" xmlns:w15="http://schemas.microsoft.com/office/word/2012/wordml" xmlns:w16cex="http://schemas.microsoft.com/office/word/2018/wordml/cex" xmlns:w16cid="http://schemas.microsoft.com/office/word/2016/wordml/cid" xmlns:w16="http://schemas.microsoft.com/office/word/2018/wordml" xmlns:w16du="http://schemas.microsoft.com/office/word/2023/wordml/word16du" xmlns:w16sdtdh="http://schemas.microsoft.com/office/word/2020/wordml/sdtdatahash" xmlns:w16sdtfl="http://schemas.microsoft.com/office/word/2024/wordml/sdtformatlock" xmlns:w16se="http://schemas.microsoft.com/office/word/2015/wordml/symex" xmlns:wpg="http://schemas.microsoft.com/office/word/2010/wordprocessingGroup" xmlns:wpi="http://schemas.microsoft.com/office/word/2010/wordprocessingInk" xmlns:wne="http://schemas.microsoft.com/office/word/2006/wordml" xmlns:wps="http://schemas.microsoft.com/office/word/2010/wordprocessingShape" mc:Ignorable="w14 w15 w16se w16cid w16 w16cex w16sdtdh w16sdtfl w16du wp14">
+<w:hdr xmlns:wpc="http://schemas.microsoft.com/office/word/2010/wordprocessingCanvas" xmlns:cx="http://schemas.microsoft.com/office/drawing/2014/chartex" xmlns:cx1="http://schemas.microsoft.com/office/drawing/2015/9/8/chartex" xmlns:cx2="http://schemas.microsoft.com/office/drawing/2015/10/21/chartex" xmlns:cx3="http://schemas.microsoft.com/office/drawing/2016/5/9/chartex" xmlns:cx4="http://schemas.microsoft.com/office/drawing/2016/5/10/chartex" xmlns:cx5="http://schemas.microsoft.com/office/drawing/2016/5/11/chartex" xmlns:cx6="http://schemas.microsoft.com/office/drawing/2016/5/12/chartex" xmlns:cx7="http://schemas.microsoft.com/office/drawing/2016/5/13/chartex" xmlns:cx8="http://schemas.microsoft.com/office/drawing/2016/5/14/chartex" xmlns:mc="http://schemas.openxmlformats.org/markup-compatibility/2006" xmlns:aink="http://schemas.microsoft.com/office/drawing/2016/ink" xmlns:am3d="http://schemas.microsoft.com/office/drawing/2017/model3d" xmlns:o="urn:schemas-microsoft-com:office:office" xmlns:r="http://schemas.openxmlformats.org/officeDocument/2006/relationships" xmlns:m="http://schemas.openxmlformats.org/officeDocument/2006/math" xmlns:v="urn:schemas-microsoft-com:vml" xmlns:wp14="http://schemas.microsoft.com/office/word/2010/wordprocessingDrawing" xmlns:wp="http://schemas.openxmlformats.org/drawingml/2006/wordprocessingDrawing" xmlns:w10="urn:schemas-microsoft-com:office:word" xmlns:w="http://schemas.openxmlformats.org/wordprocessingml/2006/main" xmlns:w14="http://schemas.microsoft.com/office/word/2010/wordml" xmlns:w15="http://schemas.microsoft.com/office/word/2012/wordml" xmlns:w16cex="http://schemas.microsoft.com/office/word/2018/wordml/cex" xmlns:w16cid="http://schemas.microsoft.com/office/word/2016/wordml/cid" xmlns:w16="http://schemas.microsoft.com/office/word/2018/wordml" xmlns:w16sdtdh="http://schemas.microsoft.com/office/word/2020/wordml/sdtdatahash" xmlns:w16se="http://schemas.microsoft.com/office/word/2015/wordml/symex" xmlns:wpg="http://schemas.microsoft.com/office/word/2010/wordprocessingGroup" xmlns:wpi="http://schemas.microsoft.com/office/word/2010/wordprocessingInk" xmlns:wne="http://schemas.microsoft.com/office/word/2006/wordml" xmlns:wps="http://schemas.microsoft.com/office/word/2010/wordprocessingShape" mc:Ignorable="w14 w15 w16se w16cid w16 w16cex w16sdtdh wp14">
   <w:p>
     <w:pPr>
       <w:jc w:val="center"/>
@@ -1983,7 +1850,7 @@
 </file>
 
 <file path=word/styles.xml><?xml version="1.0" encoding="utf-8"?>
-<w:styles xmlns:mc="http://schemas.openxmlformats.org/markup-compatibility/2006" xmlns:r="http://schemas.openxmlformats.org/officeDocument/2006/relationships" xmlns:w="http://schemas.openxmlformats.org/wordprocessingml/2006/main" xmlns:w14="http://schemas.microsoft.com/office/word/2010/wordml" xmlns:w15="http://schemas.microsoft.com/office/word/2012/wordml" xmlns:w16cex="http://schemas.microsoft.com/office/word/2018/wordml/cex" xmlns:w16cid="http://schemas.microsoft.com/office/word/2016/wordml/cid" xmlns:w16="http://schemas.microsoft.com/office/word/2018/wordml" xmlns:w16du="http://schemas.microsoft.com/office/word/2023/wordml/word16du" xmlns:w16sdtdh="http://schemas.microsoft.com/office/word/2020/wordml/sdtdatahash" xmlns:w16sdtfl="http://schemas.microsoft.com/office/word/2024/wordml/sdtformatlock" xmlns:w16se="http://schemas.microsoft.com/office/word/2015/wordml/symex" mc:Ignorable="w14 w15 w16se w16cid w16 w16cex w16sdtdh w16sdtfl w16du">
+<w:styles xmlns:mc="http://schemas.openxmlformats.org/markup-compatibility/2006" xmlns:r="http://schemas.openxmlformats.org/officeDocument/2006/relationships" xmlns:w="http://schemas.openxmlformats.org/wordprocessingml/2006/main" xmlns:w14="http://schemas.microsoft.com/office/word/2010/wordml" xmlns:w15="http://schemas.microsoft.com/office/word/2012/wordml" xmlns:w16cex="http://schemas.microsoft.com/office/word/2018/wordml/cex" xmlns:w16cid="http://schemas.microsoft.com/office/word/2016/wordml/cid" xmlns:w16="http://schemas.microsoft.com/office/word/2018/wordml" xmlns:w16sdtdh="http://schemas.microsoft.com/office/word/2020/wordml/sdtdatahash" xmlns:w16se="http://schemas.microsoft.com/office/word/2015/wordml/symex" mc:Ignorable="w14 w15 w16se w16cid w16 w16cex w16sdtdh">
   <w:docDefaults>
     <w:rPrDefault>
       <w:rPr>

</xml_diff>

<commit_message>
modal de caddie implementado
</commit_message>
<xml_diff>
--- a/backend_flask/plantillas_word/A6- Solicitud Excepcional.docx
+++ b/backend_flask/plantillas_word/A6- Solicitud Excepcional.docx
@@ -660,6 +660,13 @@
                 <w:szCs w:val="24"/>
               </w:rPr>
             </w:pPr>
+            <w:r>
+              <w:rPr>
+                <w:sz w:val="24"/>
+                <w:szCs w:val="24"/>
+              </w:rPr>
+              <w:t>[!]</w:t>
+            </w:r>
             <w:r>
               <w:rPr>
                 <w:sz w:val="24"/>

</xml_diff>

<commit_message>
Añadido codigo de convenio y fix en plantillas
</commit_message>
<xml_diff>
--- a/backend_flask/plantillas_word/A6- Solicitud Excepcional.docx
+++ b/backend_flask/plantillas_word/A6- Solicitud Excepcional.docx
@@ -478,6 +478,13 @@
                 <w:szCs w:val="24"/>
               </w:rPr>
             </w:pPr>
+            <w:r>
+              <w:rPr>
+                <w:sz w:val="24"/>
+                <w:szCs w:val="24"/>
+              </w:rPr>
+              <w:t>[CENTRO_CODIGO]</w:t>
+            </w:r>
           </w:p>
         </w:tc>
         <w:tc>
@@ -968,7 +975,16 @@
           <w:sz w:val="20"/>
           <w:szCs w:val="20"/>
         </w:rPr>
-        <w:t>IRECCIÓN PROVINCIAL DE EDUCACIÓN DE…….</w:t>
+        <w:t>IRECCIÓN PROVINCIAL DE EDUCACIÓN DE</w:t>
+      </w:r>
+      <w:r>
+        <w:rPr>
+          <w:b/>
+          <w:bCs/>
+          <w:sz w:val="20"/>
+          <w:szCs w:val="20"/>
+        </w:rPr>
+        <w:t xml:space="preserve"> [CENTRO_PROVINCIA]</w:t>
       </w:r>
     </w:p>
     <w:tbl>

</xml_diff>